<commit_message>
Update microLED electrical characterization files and remove outdated images
</commit_message>
<xml_diff>
--- a/deliverable/microLED_electrical_characterization/report/Electrical_Characterization_section.docx
+++ b/deliverable/microLED_electrical_characterization/report/Electrical_Characterization_section.docx
@@ -2012,6 +2012,58 @@
     </w:p>
     <w:p>
       <w:pPr>
+        <w:jc w:val="center"/>
+      </w:pPr>
+      <w:r>
+        <w:drawing>
+          <wp:inline xmlns:a="http://schemas.openxmlformats.org/drawingml/2006/main" xmlns:pic="http://schemas.openxmlformats.org/drawingml/2006/picture">
+            <wp:extent cx="3096000" cy="2214276"/>
+            <wp:docPr id="5" name="Picture 5"/>
+            <wp:cNvGraphicFramePr>
+              <a:graphicFrameLocks noChangeAspect="1"/>
+            </wp:cNvGraphicFramePr>
+            <a:graphic>
+              <a:graphicData uri="http://schemas.openxmlformats.org/drawingml/2006/picture">
+                <pic:pic>
+                  <pic:nvPicPr>
+                    <pic:cNvPr id="0" name="fig6_vf_by_condition.png"/>
+                    <pic:cNvPicPr/>
+                  </pic:nvPicPr>
+                  <pic:blipFill>
+                    <a:blip r:embed="rId13"/>
+                    <a:stretch>
+                      <a:fillRect/>
+                    </a:stretch>
+                  </pic:blipFill>
+                  <pic:spPr>
+                    <a:xfrm>
+                      <a:off x="0" y="0"/>
+                      <a:ext cx="3096000" cy="2214276"/>
+                    </a:xfrm>
+                    <a:prstGeom prst="rect"/>
+                  </pic:spPr>
+                </pic:pic>
+              </a:graphicData>
+            </a:graphic>
+          </wp:inline>
+        </w:drawing>
+      </w:r>
+    </w:p>
+    <w:p>
+      <w:pPr>
+        <w:jc w:val="center"/>
+      </w:pPr>
+      <w:r>
+        <w:rPr>
+          <w:b w:val="0"/>
+          <w:i/>
+          <w:sz w:val="17"/>
+        </w:rPr>
+        <w:t>Fig. 5. Forward voltage at 10 mA by condition. The full spread across all 29 channels is 13 mV, which is consistent with dice drawn from one reel.</w:t>
+      </w:r>
+    </w:p>
+    <w:p>
+      <w:pPr>
         <w:pStyle w:val="Heading2"/>
       </w:pPr>
       <w:r>
@@ -2048,7 +2100,7 @@
         <w:drawing>
           <wp:inline xmlns:a="http://schemas.openxmlformats.org/drawingml/2006/main" xmlns:pic="http://schemas.openxmlformats.org/drawingml/2006/picture">
             <wp:extent cx="3096000" cy="2185684"/>
-            <wp:docPr id="5" name="Picture 5"/>
+            <wp:docPr id="6" name="Picture 6"/>
             <wp:cNvGraphicFramePr>
               <a:graphicFrameLocks noChangeAspect="1"/>
             </wp:cNvGraphicFramePr>
@@ -2060,7 +2112,7 @@
                     <pic:cNvPicPr/>
                   </pic:nvPicPr>
                   <pic:blipFill>
-                    <a:blip r:embed="rId13"/>
+                    <a:blip r:embed="rId14"/>
                     <a:stretch>
                       <a:fillRect/>
                     </a:stretch>
@@ -2089,7 +2141,7 @@
           <w:i/>
           <w:sz w:val="17"/>
         </w:rPr>
-        <w:t>Fig. 5. A contaminated die (S3 D1) against a healthy one. The curves agree above 3 mA and diverge by 540 mV at the bottom of the sweep.</w:t>
+        <w:t>Fig. 6. A contaminated die (S3 D1) against a healthy one. The curves agree above 3 mA and diverge by 540 mV at the bottom of the sweep.</w:t>
       </w:r>
     </w:p>
     <w:p>
@@ -2130,7 +2182,7 @@
         <w:drawing>
           <wp:inline xmlns:a="http://schemas.openxmlformats.org/drawingml/2006/main" xmlns:pic="http://schemas.openxmlformats.org/drawingml/2006/picture">
             <wp:extent cx="3096000" cy="2015507"/>
-            <wp:docPr id="6" name="Picture 6"/>
+            <wp:docPr id="7" name="Picture 7"/>
             <wp:cNvGraphicFramePr>
               <a:graphicFrameLocks noChangeAspect="1"/>
             </wp:cNvGraphicFramePr>
@@ -2142,7 +2194,7 @@
                     <pic:cNvPicPr/>
                   </pic:nvPicPr>
                   <pic:blipFill>
-                    <a:blip r:embed="rId14"/>
+                    <a:blip r:embed="rId15"/>
                     <a:stretch>
                       <a:fillRect/>
                     </a:stretch>
@@ -2171,7 +2223,7 @@
           <w:i/>
           <w:sz w:val="17"/>
         </w:rPr>
-        <w:t>Fig. 6. Three channels, each measured after three independent re-seatings of the two jumpers. Nothing else changed between points.</w:t>
+        <w:t>Fig. 7. Three channels, each measured after three independent re-seatings of the two jumpers. Nothing else changed between points.</w:t>
       </w:r>
     </w:p>
     <w:p>
@@ -2221,7 +2273,7 @@
         <w:drawing>
           <wp:inline xmlns:a="http://schemas.openxmlformats.org/drawingml/2006/main" xmlns:pic="http://schemas.openxmlformats.org/drawingml/2006/picture">
             <wp:extent cx="3096000" cy="2008795"/>
-            <wp:docPr id="7" name="Picture 7"/>
+            <wp:docPr id="8" name="Picture 8"/>
             <wp:cNvGraphicFramePr>
               <a:graphicFrameLocks noChangeAspect="1"/>
             </wp:cNvGraphicFramePr>
@@ -2233,7 +2285,7 @@
                     <pic:cNvPicPr/>
                   </pic:nvPicPr>
                   <pic:blipFill>
-                    <a:blip r:embed="rId15"/>
+                    <a:blip r:embed="rId16"/>
                     <a:stretch>
                       <a:fillRect/>
                     </a:stretch>
@@ -2262,7 +2314,7 @@
           <w:i/>
           <w:sz w:val="17"/>
         </w:rPr>
-        <w:t>Fig. 7. Extracted series resistance against current-on time, same channel throughout. Error bars are the standard error of the fit.</w:t>
+        <w:t>Fig. 8. Extracted series resistance against current-on time, same channel throughout. Error bars are the standard error of the fit.</w:t>
       </w:r>
     </w:p>
     <w:p>

</xml_diff>